<commit_message>
Disciplina POO JAVA 20Mar2025
</commit_message>
<xml_diff>
--- a/04 Works/Avaliação NF PBL - Wyden UniRuy Aplicação Web JAVA 2025.docx
+++ b/04 Works/Avaliação NF PBL - Wyden UniRuy Aplicação Web JAVA 2025.docx
@@ -31,6 +31,16 @@
           <w:sz w:val="40"/>
           <w:szCs w:val="40"/>
         </w:rPr>
+        <w:t xml:space="preserve"> Web/Mobile</w:t>
+      </w:r>
+      <w:r>
+        <w:rPr>
+          <w:rFonts w:ascii="Times New Roman" w:hAnsi="Times New Roman" w:cs="Times New Roman"/>
+          <w:b/>
+          <w:bCs/>
+          <w:sz w:val="40"/>
+          <w:szCs w:val="40"/>
+        </w:rPr>
         <w:t xml:space="preserve"> Extensionista</w:t>
       </w:r>
     </w:p>
@@ -55,7 +65,51 @@
           <w:sz w:val="36"/>
           <w:szCs w:val="36"/>
         </w:rPr>
-        <w:t>Avaliação NF PBL - Aplicação Web ou Mobile</w:t>
+        <w:t xml:space="preserve">Avaliação </w:t>
+      </w:r>
+      <w:r>
+        <w:rPr>
+          <w:rFonts w:ascii="Times New Roman" w:hAnsi="Times New Roman" w:cs="Times New Roman"/>
+          <w:b/>
+          <w:bCs/>
+          <w:color w:val="FF0000"/>
+          <w:sz w:val="36"/>
+          <w:szCs w:val="36"/>
+        </w:rPr>
+        <w:t>POO JAVA</w:t>
+      </w:r>
+      <w:r>
+        <w:rPr>
+          <w:rFonts w:ascii="Times New Roman" w:hAnsi="Times New Roman" w:cs="Times New Roman"/>
+          <w:b/>
+          <w:bCs/>
+          <w:color w:val="FF0000"/>
+          <w:sz w:val="36"/>
+          <w:szCs w:val="36"/>
+        </w:rPr>
+        <w:t xml:space="preserve"> PBL - Aplicação Web</w:t>
+      </w:r>
+      <w:r>
+        <w:rPr>
+          <w:rFonts w:ascii="Times New Roman" w:hAnsi="Times New Roman" w:cs="Times New Roman"/>
+          <w:b/>
+          <w:bCs/>
+          <w:color w:val="FF0000"/>
+          <w:sz w:val="36"/>
+          <w:szCs w:val="36"/>
+        </w:rPr>
+        <w:t>/</w:t>
+      </w:r>
+      <w:r>
+        <w:rPr>
+          <w:rFonts w:ascii="Times New Roman" w:hAnsi="Times New Roman" w:cs="Times New Roman"/>
+          <w:b/>
+          <w:bCs/>
+          <w:color w:val="FF0000"/>
+          <w:sz w:val="36"/>
+          <w:szCs w:val="36"/>
+        </w:rPr>
+        <w:t>Mobile</w:t>
       </w:r>
     </w:p>
     <w:p>
@@ -84,25 +138,14 @@
         </w:rPr>
         <w:t xml:space="preserve">: </w:t>
       </w:r>
-      <w:proofErr w:type="spellStart"/>
-      <w:r>
-        <w:rPr>
-          <w:rFonts w:ascii="Times New Roman" w:hAnsi="Times New Roman" w:cs="Times New Roman"/>
-          <w:sz w:val="24"/>
-          <w:szCs w:val="24"/>
-        </w:rPr>
-        <w:t>Wyden</w:t>
-      </w:r>
-      <w:proofErr w:type="spellEnd"/>
-      <w:r>
-        <w:rPr>
-          <w:rFonts w:ascii="Times New Roman" w:hAnsi="Times New Roman" w:cs="Times New Roman"/>
-          <w:sz w:val="24"/>
-          <w:szCs w:val="24"/>
-        </w:rPr>
-        <w:t xml:space="preserve"> | </w:t>
-      </w:r>
-      <w:proofErr w:type="spellStart"/>
+      <w:r>
+        <w:rPr>
+          <w:rFonts w:ascii="Times New Roman" w:hAnsi="Times New Roman" w:cs="Times New Roman"/>
+          <w:sz w:val="24"/>
+          <w:szCs w:val="24"/>
+        </w:rPr>
+        <w:t xml:space="preserve">Wyden | </w:t>
+      </w:r>
       <w:r>
         <w:rPr>
           <w:rFonts w:ascii="Times New Roman" w:hAnsi="Times New Roman" w:cs="Times New Roman"/>
@@ -111,7 +154,6 @@
         </w:rPr>
         <w:t>UniRuy</w:t>
       </w:r>
-      <w:proofErr w:type="spellEnd"/>
       <w:r>
         <w:rPr>
           <w:rFonts w:ascii="Times New Roman" w:hAnsi="Times New Roman" w:cs="Times New Roman"/>
@@ -170,7 +212,15 @@
           <w:sz w:val="24"/>
           <w:szCs w:val="24"/>
         </w:rPr>
-        <w:t>17</w:t>
+        <w:t>1</w:t>
+      </w:r>
+      <w:r>
+        <w:rPr>
+          <w:rFonts w:ascii="Times New Roman" w:hAnsi="Times New Roman" w:cs="Times New Roman"/>
+          <w:sz w:val="24"/>
+          <w:szCs w:val="24"/>
+        </w:rPr>
+        <w:t>9</w:t>
       </w:r>
       <w:r>
         <w:rPr>
@@ -212,15 +262,31 @@
           <w:sz w:val="24"/>
           <w:szCs w:val="24"/>
         </w:rPr>
-        <w:t xml:space="preserve">NF </w:t>
-      </w:r>
-      <w:r>
-        <w:rPr>
-          <w:rFonts w:ascii="Times New Roman" w:hAnsi="Times New Roman" w:cs="Times New Roman"/>
-          <w:sz w:val="24"/>
-          <w:szCs w:val="24"/>
-        </w:rPr>
-        <w:t>10 pontos</w:t>
+        <w:t>Projeto Web/Mobile</w:t>
+      </w:r>
+      <w:r>
+        <w:rPr>
+          <w:rFonts w:ascii="Times New Roman" w:hAnsi="Times New Roman" w:cs="Times New Roman"/>
+          <w:sz w:val="24"/>
+          <w:szCs w:val="24"/>
+        </w:rPr>
+        <w:t xml:space="preserve"> </w:t>
+      </w:r>
+      <w:r>
+        <w:rPr>
+          <w:rFonts w:ascii="Times New Roman" w:hAnsi="Times New Roman" w:cs="Times New Roman"/>
+          <w:sz w:val="24"/>
+          <w:szCs w:val="24"/>
+        </w:rPr>
+        <w:t>09</w:t>
+      </w:r>
+      <w:r>
+        <w:rPr>
+          <w:rFonts w:ascii="Times New Roman" w:hAnsi="Times New Roman" w:cs="Times New Roman"/>
+          <w:sz w:val="24"/>
+          <w:szCs w:val="24"/>
+        </w:rPr>
+        <w:t xml:space="preserve"> pontos</w:t>
       </w:r>
     </w:p>
     <w:p>
@@ -1343,18 +1409,8 @@
           <w:sz w:val="24"/>
           <w:szCs w:val="24"/>
         </w:rPr>
-        <w:t xml:space="preserve">: Representa um produto do estoque, com atributos como nome, categoria, quantidade, </w:t>
-      </w:r>
-      <w:proofErr w:type="gramStart"/>
-      <w:r>
-        <w:rPr>
-          <w:rFonts w:ascii="Times New Roman" w:hAnsi="Times New Roman" w:cs="Times New Roman"/>
-          <w:sz w:val="24"/>
-          <w:szCs w:val="24"/>
-        </w:rPr>
-        <w:t>preço, etc.</w:t>
-      </w:r>
-      <w:proofErr w:type="gramEnd"/>
+        <w:t>: Representa um produto do estoque, com atributos como nome, categoria, quantidade, preço, etc.</w:t>
+      </w:r>
     </w:p>
     <w:p>
       <w:pPr>
@@ -2292,7 +2348,6 @@
                 <w:szCs w:val="28"/>
               </w:rPr>
             </w:pPr>
-            <w:proofErr w:type="spellStart"/>
             <w:r>
               <w:rPr>
                 <w:rFonts w:ascii="Arial" w:hAnsi="Arial" w:cs="Arial"/>
@@ -2301,18 +2356,7 @@
                 <w:sz w:val="28"/>
                 <w:szCs w:val="28"/>
               </w:rPr>
-              <w:t>Barema</w:t>
-            </w:r>
-            <w:proofErr w:type="spellEnd"/>
-            <w:r>
-              <w:rPr>
-                <w:rFonts w:ascii="Arial" w:hAnsi="Arial" w:cs="Arial"/>
-                <w:b/>
-                <w:bCs/>
-                <w:sz w:val="28"/>
-                <w:szCs w:val="28"/>
-              </w:rPr>
-              <w:t xml:space="preserve"> Seminário: </w:t>
+              <w:t xml:space="preserve">Barema Seminário: </w:t>
             </w:r>
             <w:r>
               <w:rPr>
@@ -2322,7 +2366,37 @@
                 <w:sz w:val="28"/>
                 <w:szCs w:val="28"/>
               </w:rPr>
-              <w:t>NF: 10 pontos</w:t>
+              <w:t>Projeto Web/Mobile</w:t>
+            </w:r>
+            <w:r>
+              <w:rPr>
+                <w:rFonts w:ascii="Arial" w:hAnsi="Arial" w:cs="Arial"/>
+                <w:b/>
+                <w:bCs/>
+                <w:sz w:val="28"/>
+                <w:szCs w:val="28"/>
+              </w:rPr>
+              <w:t xml:space="preserve">: </w:t>
+            </w:r>
+            <w:r>
+              <w:rPr>
+                <w:rFonts w:ascii="Arial" w:hAnsi="Arial" w:cs="Arial"/>
+                <w:b/>
+                <w:bCs/>
+                <w:sz w:val="28"/>
+                <w:szCs w:val="28"/>
+              </w:rPr>
+              <w:t>09</w:t>
+            </w:r>
+            <w:r>
+              <w:rPr>
+                <w:rFonts w:ascii="Arial" w:hAnsi="Arial" w:cs="Arial"/>
+                <w:b/>
+                <w:bCs/>
+                <w:sz w:val="28"/>
+                <w:szCs w:val="28"/>
+              </w:rPr>
+              <w:t xml:space="preserve"> pontos</w:t>
             </w:r>
           </w:p>
         </w:tc>
@@ -2450,7 +2524,7 @@
                 <w:sz w:val="24"/>
                 <w:szCs w:val="24"/>
               </w:rPr>
-              <w:t>2</w:t>
+              <w:t>1</w:t>
             </w:r>
             <w:r>
               <w:rPr>
@@ -2787,7 +2861,23 @@
           <w:sz w:val="24"/>
           <w:szCs w:val="24"/>
         </w:rPr>
-        <w:t>: O prazo de entrega é uma semana antes da Data NF Institucional.</w:t>
+        <w:t xml:space="preserve">: O prazo de entrega é uma semana antes da Data </w:t>
+      </w:r>
+      <w:r>
+        <w:rPr>
+          <w:rFonts w:ascii="Times New Roman" w:hAnsi="Times New Roman" w:cs="Times New Roman"/>
+          <w:sz w:val="24"/>
+          <w:szCs w:val="24"/>
+        </w:rPr>
+        <w:t>AV</w:t>
+      </w:r>
+      <w:r>
+        <w:rPr>
+          <w:rFonts w:ascii="Times New Roman" w:hAnsi="Times New Roman" w:cs="Times New Roman"/>
+          <w:sz w:val="24"/>
+          <w:szCs w:val="24"/>
+        </w:rPr>
+        <w:t xml:space="preserve"> Institucional.</w:t>
       </w:r>
     </w:p>
     <w:p>
@@ -2851,7 +2941,23 @@
           <w:sz w:val="24"/>
           <w:szCs w:val="24"/>
         </w:rPr>
-        <w:t>, a nota NF PBL será ZERADA em caso de atraso.</w:t>
+        <w:t xml:space="preserve">, a nota </w:t>
+      </w:r>
+      <w:r>
+        <w:rPr>
+          <w:rFonts w:ascii="Times New Roman" w:hAnsi="Times New Roman" w:cs="Times New Roman"/>
+          <w:sz w:val="24"/>
+          <w:szCs w:val="24"/>
+        </w:rPr>
+        <w:t>AV</w:t>
+      </w:r>
+      <w:r>
+        <w:rPr>
+          <w:rFonts w:ascii="Times New Roman" w:hAnsi="Times New Roman" w:cs="Times New Roman"/>
+          <w:sz w:val="24"/>
+          <w:szCs w:val="24"/>
+        </w:rPr>
+        <w:t xml:space="preserve"> PBL será ZERADA em caso de atraso.</w:t>
       </w:r>
     </w:p>
     <w:p>
@@ -2963,7 +3069,23 @@
           <w:sz w:val="24"/>
           <w:szCs w:val="24"/>
         </w:rPr>
-        <w:t xml:space="preserve">: Uma semana antes da Data NF Institucional, será realizado o seminário para apresentar a aplicação </w:t>
+        <w:t xml:space="preserve">: Uma semana antes da Data </w:t>
+      </w:r>
+      <w:r>
+        <w:rPr>
+          <w:rFonts w:ascii="Times New Roman" w:hAnsi="Times New Roman" w:cs="Times New Roman"/>
+          <w:sz w:val="24"/>
+          <w:szCs w:val="24"/>
+        </w:rPr>
+        <w:t xml:space="preserve">AV </w:t>
+      </w:r>
+      <w:r>
+        <w:rPr>
+          <w:rFonts w:ascii="Times New Roman" w:hAnsi="Times New Roman" w:cs="Times New Roman"/>
+          <w:sz w:val="24"/>
+          <w:szCs w:val="24"/>
+        </w:rPr>
+        <w:t xml:space="preserve">Institucional, será realizado o seminário para apresentar a aplicação </w:t>
       </w:r>
       <w:r>
         <w:rPr>
@@ -3218,21 +3340,7 @@
       <w:rPr>
         <w:rFonts w:ascii="Tahoma" w:hAnsi="Tahoma" w:cs="Tahoma"/>
       </w:rPr>
-      <w:t xml:space="preserve">Professor </w:t>
-    </w:r>
-    <w:proofErr w:type="spellStart"/>
-    <w:r>
-      <w:rPr>
-        <w:rFonts w:ascii="Tahoma" w:hAnsi="Tahoma" w:cs="Tahoma"/>
-      </w:rPr>
-      <w:t>Msc</w:t>
-    </w:r>
-    <w:proofErr w:type="spellEnd"/>
-    <w:r>
-      <w:rPr>
-        <w:rFonts w:ascii="Tahoma" w:hAnsi="Tahoma" w:cs="Tahoma"/>
-      </w:rPr>
-      <w:t>: Heleno Cardoso, Doutorando Ciência da Computação PPGCOMP UFBA</w:t>
+      <w:t>Professor Msc: Heleno Cardoso, Doutorando Ciência da Computação PPGCOMP UFBA</w:t>
     </w:r>
   </w:p>
 </w:ftr>
@@ -5886,6 +5994,7 @@
   <w:style w:type="character" w:default="1" w:styleId="Fontepargpadro">
     <w:name w:val="Default Paragraph Font"/>
     <w:uiPriority w:val="1"/>
+    <w:semiHidden/>
     <w:unhideWhenUsed/>
   </w:style>
   <w:style w:type="table" w:default="1" w:styleId="Tabelanormal">

</xml_diff>